<commit_message>
manual and docs changes
</commit_message>
<xml_diff>
--- a/packages/core/src/state-testing-and-appendices/TechnicalDocumentation.docx
+++ b/packages/core/src/state-testing-and-appendices/TechnicalDocumentation.docx
@@ -456,6 +456,50 @@
           <w:lang w:val="en-US"/>
         </w:rPr>
         <w:t>– For styling.</w:t>
+      </w:r>
+    </w:p>
+    <w:p>
+      <w:pPr>
+        <w:pStyle w:val="ListParagraph"/>
+        <w:numPr>
+          <w:ilvl w:val="0"/>
+          <w:numId w:val="19"/>
+        </w:numPr>
+        <w:rPr>
+          <w:lang w:val="en-US"/>
+        </w:rPr>
+      </w:pPr>
+      <w:r>
+        <w:rPr>
+          <w:b/>
+          <w:bCs/>
+          <w:lang w:val="en-US"/>
+        </w:rPr>
+        <w:t>VS Code</w:t>
+      </w:r>
+      <w:r>
+        <w:rPr>
+          <w:lang w:val="en-US"/>
+        </w:rPr>
+        <w:t xml:space="preserve"> – </w:t>
+      </w:r>
+      <w:r>
+        <w:rPr>
+          <w:lang w:val="en-US"/>
+        </w:rPr>
+        <w:t>As extension host and for interacting with VS Code environment and its features like webview communication, commands, editor interaction</w:t>
+      </w:r>
+      <w:r>
+        <w:rPr>
+          <w:lang w:val="en-US"/>
+        </w:rPr>
+        <w:t>, Copilot</w:t>
+      </w:r>
+      <w:r>
+        <w:rPr>
+          <w:lang w:val="en-US"/>
+        </w:rPr>
+        <w:t xml:space="preserve"> etc.</w:t>
       </w:r>
     </w:p>
     <w:p>
@@ -5921,7 +5965,7 @@
           <w:noProof/>
         </w:rPr>
         <w:drawing>
-          <wp:anchor distT="0" distB="0" distL="114300" distR="114300" simplePos="0" relativeHeight="251657728" behindDoc="0" locked="0" layoutInCell="1" allowOverlap="1" wp14:anchorId="7EFFC19B" wp14:editId="27DBA36B">
+          <wp:anchor distT="0" distB="0" distL="114300" distR="114300" simplePos="0" relativeHeight="251657728" behindDoc="0" locked="0" layoutInCell="1" allowOverlap="1" wp14:anchorId="7EFFC19B" wp14:editId="5B13F4DC">
             <wp:simplePos x="0" y="0"/>
             <wp:positionH relativeFrom="column">
               <wp:posOffset>-470535</wp:posOffset>
@@ -6208,7 +6252,7 @@
           <w:noProof/>
         </w:rPr>
         <w:drawing>
-          <wp:anchor distT="0" distB="0" distL="114300" distR="114300" simplePos="0" relativeHeight="251653632" behindDoc="0" locked="0" layoutInCell="1" allowOverlap="1" wp14:anchorId="6E22DA17" wp14:editId="71413A9A">
+          <wp:anchor distT="0" distB="0" distL="114300" distR="114300" simplePos="0" relativeHeight="251654656" behindDoc="0" locked="0" layoutInCell="1" allowOverlap="1" wp14:anchorId="6E22DA17" wp14:editId="71413A9A">
             <wp:simplePos x="0" y="0"/>
             <wp:positionH relativeFrom="column">
               <wp:posOffset>-398145</wp:posOffset>
@@ -6313,7 +6357,7 @@
           <w:noProof/>
         </w:rPr>
         <w:drawing>
-          <wp:anchor distT="0" distB="0" distL="114300" distR="114300" simplePos="0" relativeHeight="251656704" behindDoc="0" locked="0" layoutInCell="1" allowOverlap="1" wp14:anchorId="7200E4A2" wp14:editId="6E72094C">
+          <wp:anchor distT="0" distB="0" distL="114300" distR="114300" simplePos="0" relativeHeight="251655680" behindDoc="0" locked="0" layoutInCell="1" allowOverlap="1" wp14:anchorId="7200E4A2" wp14:editId="6E72094C">
             <wp:simplePos x="0" y="0"/>
             <wp:positionH relativeFrom="column">
               <wp:posOffset>-347345</wp:posOffset>
@@ -6407,7 +6451,7 @@
           <w:noProof/>
         </w:rPr>
         <w:drawing>
-          <wp:anchor distT="0" distB="0" distL="114300" distR="114300" simplePos="0" relativeHeight="251657728" behindDoc="0" locked="0" layoutInCell="1" allowOverlap="1" wp14:anchorId="282F9E86" wp14:editId="55A373B3">
+          <wp:anchor distT="0" distB="0" distL="114300" distR="114300" simplePos="0" relativeHeight="251658752" behindDoc="0" locked="0" layoutInCell="1" allowOverlap="1" wp14:anchorId="282F9E86" wp14:editId="55A373B3">
             <wp:simplePos x="0" y="0"/>
             <wp:positionH relativeFrom="column">
               <wp:posOffset>-330200</wp:posOffset>
@@ -7784,7 +7828,6 @@
   <w:style w:type="character" w:default="1" w:styleId="DefaultParagraphFont">
     <w:name w:val="Default Paragraph Font"/>
     <w:uiPriority w:val="1"/>
-    <w:semiHidden/>
     <w:unhideWhenUsed/>
   </w:style>
   <w:style w:type="table" w:default="1" w:styleId="TableNormal">

</xml_diff>